<commit_message>
Rapport v2 : rapport actuariel et statistique, classeur des calculs avec traçabilité, sources validées
- rapport_v2_fppn.py : 113 diapositives, 37 figures, 19 tableaux, contrôle automatique des chiffres (328/328)
- analyses_complements_fppn.py : inflation Banque mondiale, TCAM, tendances, IC de Wilson, sensibilités, tables CIMA
- images_code_fppn.py : extraits de code mis en forme façon VS Code
- classeur_v2_fppn.py : classeur des calculs v2 avec onglet de traçabilité
- note interne : anomalies 19 et 20 (mécanos Grenier, fichier aller PEP juillet 2024)

Co-Authored-By: Claude Opus 5.5 <noreply@anthropic.com>
Claude-Session: https://claude.ai/code/session_01QrZoDwZJKb9thfUp96Ro9x
</commit_message>
<xml_diff>
--- a/rapport/FPPN_Note_interne_anomalies_donnees_20261018_CONFIDENTIEL.docx
+++ b/rapport/FPPN_Note_interne_anomalies_donnees_20261018_CONFIDENTIEL.docx
@@ -985,6 +985,84 @@
           </w:p>
         </w:tc>
       </w:tr>
+      <w:tr>
+        <w:tc>
+          <w:tcPr>
+            <w:tcW w:type="dxa" w:w="9972"/>
+            <w:gridSpan w:val="3"/>
+            <w:shd w:val="clear" w:color="auto" w:fill="BBBCBC"/>
+          </w:tcPr>
+          <w:p>
+            <w:r>
+              <w:t>D. Anomalies relevées lors de la version 2 du rapport (18/10/2026)</w:t>
+            </w:r>
+          </w:p>
+        </w:tc>
+      </w:tr>
+      <w:tr>
+        <w:tc>
+          <w:tcPr>
+            <w:tcW w:type="dxa" w:w="567"/>
+          </w:tcPr>
+          <w:p>
+            <w:r>
+              <w:t>19</w:t>
+            </w:r>
+          </w:p>
+        </w:tc>
+        <w:tc>
+          <w:tcPr>
+            <w:tcW w:type="dxa" w:w="3118"/>
+          </w:tcPr>
+          <w:p>
+            <w:r>
+              <w:t>Mécanos de 2 ou 3 chiffres dans le Grenier</w:t>
+            </w:r>
+          </w:p>
+        </w:tc>
+        <w:tc>
+          <w:tcPr>
+            <w:tcW w:type="dxa" w:w="5953"/>
+          </w:tcPr>
+          <w:p>
+            <w:r>
+              <w:t>Balance âgée Grenier au 31/08/2026 : mécanos 142, 87 et 166 (saisie anormale), prêts de plus de trois ans de retard encore inscrits (rapport v2, calcul pas à pas des prêts en retard).</w:t>
+            </w:r>
+          </w:p>
+        </w:tc>
+      </w:tr>
+      <w:tr>
+        <w:tc>
+          <w:tcPr>
+            <w:tcW w:type="dxa" w:w="567"/>
+          </w:tcPr>
+          <w:p>
+            <w:r>
+              <w:t>20</w:t>
+            </w:r>
+          </w:p>
+        </w:tc>
+        <w:tc>
+          <w:tcPr>
+            <w:tcW w:type="dxa" w:w="3118"/>
+          </w:tcPr>
+          <w:p>
+            <w:r>
+              <w:t>Fichier aller PEP de juillet 2024 incomplet</w:t>
+            </w:r>
+          </w:p>
+        </w:tc>
+        <w:tc>
+          <w:tcPr>
+            <w:tcW w:type="dxa" w:w="5953"/>
+          </w:tcPr>
+          <w:p>
+            <w:r>
+              <w:t>FICHIER ALLER JUILLET 2024 : 7 180 lignes aller contre 11 654 au retour, taux apparent de 150,62 % (rapport v2, calcul pas à pas des écarts du PEP).</w:t>
+            </w:r>
+          </w:p>
+        </w:tc>
+      </w:tr>
     </w:tbl>
     <w:p>
       <w:pPr>
@@ -1006,7 +1084,7 @@
           <w:b w:val="0"/>
           <w:sz w:val="20"/>
         </w:rPr>
-        <w:t>Suite à donner. Les points 1 à 5 et 7 à 12 sont repris dans la PBC pointée (onglet « Points à clarifier ») pour transmission au FPPN. Le point 6 est à signaler oralement. Les points 13 à 18 figurent dans le rapport de façon générale et seront discutés avec le chef de mission avant toute diffusion.</w:t>
+        <w:t>Suite à donner. Les points 1 à 5 et 7 à 12 sont repris dans la PBC pointée (onglet « Points à clarifier ») pour transmission au FPPN. Le point 6 est à signaler oralement. Les points 13 à 18 figurent dans le rapport de façon générale et seront discutés avec le chef de mission avant toute diffusion. Les points 19 et 20 sont à ajouter aux questions posées au FPPN (Grenier et service PEP).</w:t>
       </w:r>
     </w:p>
     <w:sectPr>

</xml_diff>